<commit_message>
Apply August 25 meeting decisions
</commit_message>
<xml_diff>
--- a/reports/Data_for_Dinner_Food_Access_Analysis.docx
+++ b/reports/Data_for_Dinner_Food_Access_Analysis.docx
@@ -62,7 +62,7 @@
           <w:color w:val="0B2545"/>
           <w:sz w:val="22"/>
         </w:rPr>
-        <w:t>Global → United States → project-defined Southeast → Alabama. Food allergies are outside the active analysis and are handled as a separately gated next crawl.</w:t>
+        <w:t>Global to United States to project-defined Southeast to Alabama. Food allergies, race and gender demographic analysis, and straight-line distance are outside the active analysis.</w:t>
       </w:r>
     </w:p>
     <w:tbl>
@@ -117,7 +117,7 @@
                 <w:color w:val="12304F"/>
                 <w:sz w:val="19"/>
               </w:rPr>
-              <w:t>Prepared for</w:t>
+              <w:t>Prepared by</w:t>
             </w:r>
           </w:p>
         </w:tc>
@@ -146,7 +146,7 @@
                 <w:color w:val="000000"/>
                 <w:sz w:val="19"/>
               </w:rPr>
-              <w:t>Sharon Brooks, Sandra Kopecky, and April Gillespie</w:t>
+              <w:t>Data for Dinner 2026 project team</w:t>
             </w:r>
           </w:p>
         </w:tc>
@@ -431,7 +431,7 @@
           <w:color w:val="000000"/>
           <w:sz w:val="22"/>
         </w:rPr>
-        <w:t>United States: USDA estimates 13.7% of U.S. households were food insecure in 2024—18.34 million households. Very low food security affected 5.4%, or 7.20 million households.</w:t>
+        <w:t>United States: USDA estimates 13.7% of U.S. households were food insecure in 2024, representing 18.34 million households. Very low food security affected 5.4%, or 7.20 million households.</w:t>
       </w:r>
     </w:p>
     <w:p>
@@ -469,7 +469,7 @@
           <w:color w:val="000000"/>
           <w:sz w:val="22"/>
         </w:rPr>
-        <w:t>Alabama: 20.2% of low-income residents—656,013 people—are beyond the primary retailer-access threshold.</w:t>
+        <w:t>Alabama: 20.2% of low-income residents, or 656,013 people, are beyond the primary retailer-access threshold.</w:t>
       </w:r>
     </w:p>
     <w:p>
@@ -507,7 +507,7 @@
           <w:color w:val="000000"/>
           <w:sz w:val="22"/>
         </w:rPr>
-        <w:t>Sensitivity: Alabama's low-income burden is 20.2% using driving distance and 8.6% using straight-line distance.</w:t>
+        <w:t>Sensitivity: Alabama's low-income burden is 20.2% at the primary threshold, 35.9% at 0.5 mile urban / 10 miles rural, and 19.6% at 1 mile urban / 20 miles rural.</w:t>
       </w:r>
     </w:p>
     <w:p>
@@ -909,6 +909,98 @@
                 <w:sz w:val="17"/>
               </w:rPr>
               <w:t>Avoid a broad crawl that mixes vintages and measures without an analytical purpose.</w:t>
+            </w:r>
+          </w:p>
+        </w:tc>
+      </w:tr>
+      <w:tr>
+        <w:trPr>
+          <w:cantSplit/>
+        </w:trPr>
+        <w:tc>
+          <w:tcPr>
+            <w:tcW w:type="dxa" w:w="2080"/>
+            <w:tcMar>
+              <w:top w:w="80" w:type="dxa"/>
+              <w:start w:w="120" w:type="dxa"/>
+              <w:bottom w:w="80" w:type="dxa"/>
+              <w:end w:w="120" w:type="dxa"/>
+            </w:tcMar>
+            <w:vAlign w:val="center"/>
+          </w:tcPr>
+          <w:p>
+            <w:pPr>
+              <w:keepLines/>
+              <w:spacing w:before="0" w:after="0" w:line="252" w:lineRule="auto"/>
+              <w:jc w:val="left"/>
+            </w:pPr>
+            <w:r/>
+            <w:r>
+              <w:rPr>
+                <w:rFonts w:ascii="Calibri" w:hAnsi="Calibri"/>
+                <w:b w:val="0"/>
+                <w:color w:val="000000"/>
+                <w:sz w:val="17"/>
+              </w:rPr>
+              <w:t>Distance method</w:t>
+            </w:r>
+          </w:p>
+        </w:tc>
+        <w:tc>
+          <w:tcPr>
+            <w:tcW w:type="dxa" w:w="2560"/>
+            <w:tcMar>
+              <w:top w:w="80" w:type="dxa"/>
+              <w:start w:w="120" w:type="dxa"/>
+              <w:bottom w:w="80" w:type="dxa"/>
+              <w:end w:w="120" w:type="dxa"/>
+            </w:tcMar>
+            <w:vAlign w:val="center"/>
+          </w:tcPr>
+          <w:p>
+            <w:pPr>
+              <w:keepLines/>
+              <w:spacing w:before="0" w:after="0" w:line="252" w:lineRule="auto"/>
+              <w:jc w:val="left"/>
+            </w:pPr>
+            <w:r/>
+            <w:r>
+              <w:rPr>
+                <w:rFonts w:ascii="Calibri" w:hAnsi="Calibri"/>
+                <w:b w:val="0"/>
+                <w:color w:val="000000"/>
+                <w:sz w:val="17"/>
+              </w:rPr>
+              <w:t>Road network only</w:t>
+            </w:r>
+          </w:p>
+        </w:tc>
+        <w:tc>
+          <w:tcPr>
+            <w:tcW w:type="dxa" w:w="4720"/>
+            <w:tcMar>
+              <w:top w:w="80" w:type="dxa"/>
+              <w:start w:w="120" w:type="dxa"/>
+              <w:bottom w:w="80" w:type="dxa"/>
+              <w:end w:w="120" w:type="dxa"/>
+            </w:tcMar>
+            <w:vAlign w:val="center"/>
+          </w:tcPr>
+          <w:p>
+            <w:pPr>
+              <w:keepLines/>
+              <w:spacing w:before="0" w:after="0" w:line="252" w:lineRule="auto"/>
+              <w:jc w:val="left"/>
+            </w:pPr>
+            <w:r/>
+            <w:r>
+              <w:rPr>
+                <w:rFonts w:ascii="Calibri" w:hAnsi="Calibri"/>
+                <w:b w:val="0"/>
+                <w:color w:val="000000"/>
+                <w:sz w:val="17"/>
+              </w:rPr>
+              <w:t>Straight-line distance is excluded because it does not represent road travel and produced implausibly influential outliers for this study.</w:t>
             </w:r>
           </w:p>
         </w:tc>
@@ -2020,7 +2112,26 @@
           <w:color w:val="000000"/>
           <w:sz w:val="22"/>
         </w:rPr>
-        <w:t>Preserve uncertainty for state household estimates and preserve alternate distance methods in sensitivity output.</w:t>
+        <w:t>Preserve uncertainty for state household estimates and vary only road-network thresholds in sensitivity output.</w:t>
+      </w:r>
+    </w:p>
+    <w:p>
+      <w:pPr>
+        <w:keepLines/>
+        <w:numPr>
+          <w:ilvl w:val="0"/>
+          <w:numId w:val="10"/>
+        </w:numPr>
+        <w:spacing w:before="0" w:after="80" w:line="280" w:lineRule="auto"/>
+        <w:ind w:left="720" w:hanging="360"/>
+      </w:pPr>
+      <w:r>
+        <w:rPr>
+          <w:rFonts w:ascii="Calibri" w:hAnsi="Calibri"/>
+          <w:color w:val="000000"/>
+          <w:sz w:val="22"/>
+        </w:rPr>
+        <w:t>Exclude straight-line distance from imported analysis fields, results, workbook tables, and report findings.</w:t>
       </w:r>
     </w:p>
     <w:p>
@@ -2419,7 +2530,7 @@
                 <w:color w:val="000000"/>
                 <w:sz w:val="18"/>
               </w:rPr>
-              <w:t>Team files</w:t>
+              <w:t>Team files and reproducibility</w:t>
             </w:r>
           </w:p>
         </w:tc>
@@ -2448,80 +2559,12 @@
                 <w:color w:val="000000"/>
                 <w:sz w:val="18"/>
               </w:rPr>
-              <w:t>This report in DOCX/PDF and a filterable workbook with 12 sheets.</w:t>
-            </w:r>
-          </w:p>
-        </w:tc>
-      </w:tr>
-      <w:tr>
-        <w:trPr>
-          <w:cantSplit/>
-        </w:trPr>
-        <w:tc>
-          <w:tcPr>
-            <w:tcW w:type="dxa" w:w="2300"/>
-            <w:tcMar>
-              <w:top w:w="80" w:type="dxa"/>
-              <w:start w:w="120" w:type="dxa"/>
-              <w:bottom w:w="80" w:type="dxa"/>
-              <w:end w:w="120" w:type="dxa"/>
-            </w:tcMar>
-            <w:vAlign w:val="center"/>
-          </w:tcPr>
-          <w:p>
-            <w:pPr>
-              <w:keepLines/>
-              <w:spacing w:before="0" w:after="0" w:line="252" w:lineRule="auto"/>
-              <w:jc w:val="left"/>
-            </w:pPr>
-            <w:r/>
-            <w:r>
-              <w:rPr>
-                <w:rFonts w:ascii="Calibri" w:hAnsi="Calibri"/>
-                <w:b w:val="0"/>
-                <w:color w:val="000000"/>
-                <w:sz w:val="18"/>
-              </w:rPr>
-              <w:t>Reproducibility</w:t>
-            </w:r>
-          </w:p>
-        </w:tc>
-        <w:tc>
-          <w:tcPr>
-            <w:tcW w:type="dxa" w:w="7060"/>
-            <w:tcMar>
-              <w:top w:w="80" w:type="dxa"/>
-              <w:start w:w="120" w:type="dxa"/>
-              <w:bottom w:w="80" w:type="dxa"/>
-              <w:end w:w="120" w:type="dxa"/>
-            </w:tcMar>
-            <w:vAlign w:val="center"/>
-          </w:tcPr>
-          <w:p>
-            <w:pPr>
-              <w:keepLines/>
-              <w:spacing w:before="0" w:after="0" w:line="252" w:lineRule="auto"/>
-              <w:jc w:val="left"/>
-            </w:pPr>
-            <w:r/>
-            <w:r>
-              <w:rPr>
-                <w:rFonts w:ascii="Calibri" w:hAnsi="Calibri"/>
-                <w:b w:val="0"/>
-                <w:color w:val="000000"/>
-                <w:sz w:val="18"/>
-              </w:rPr>
-              <w:t>Acquisition and analysis scripts plus dependency list and methods documentation.</w:t>
+              <w:t>This report in DOCX/PDF, a filterable workbook with 12 sheets, acquisition and analysis scripts, a dependency list, and methods documentation.</w:t>
             </w:r>
           </w:p>
         </w:tc>
       </w:tr>
     </w:tbl>
-    <w:p>
-      <w:r>
-        <w:br w:type="page"/>
-      </w:r>
-    </w:p>
     <w:p>
       <w:pPr>
         <w:pStyle w:val="Heading1"/>
@@ -3938,7 +3981,7 @@
           <w:color w:val="000000"/>
           <w:sz w:val="22"/>
         </w:rPr>
-        <w:t>The U.S. section separates household food insecurity from physical proximity to SNAP-authorized retailers.</w:t>
+        <w:t xml:space="preserve"> The U.S. section separates household food insecurity from physical proximity to SNAP-authorized retailers.</w:t>
       </w:r>
     </w:p>
     <w:p>
@@ -4806,7 +4849,7 @@
                 <w:color w:val="000000"/>
                 <w:sz w:val="18"/>
               </w:rPr>
-              <w:t>—</w:t>
+              <w:t>N/A</w:t>
             </w:r>
           </w:p>
         </w:tc>
@@ -4898,7 +4941,7 @@
                 <w:color w:val="000000"/>
                 <w:sz w:val="18"/>
               </w:rPr>
-              <w:t>—</w:t>
+              <w:t>N/A</w:t>
             </w:r>
           </w:p>
         </w:tc>
@@ -4990,7 +5033,7 @@
                 <w:color w:val="000000"/>
                 <w:sz w:val="18"/>
               </w:rPr>
-              <w:t>—</w:t>
+              <w:t>N/A</w:t>
             </w:r>
           </w:p>
         </w:tc>
@@ -5082,7 +5125,7 @@
                 <w:color w:val="000000"/>
                 <w:sz w:val="18"/>
               </w:rPr>
-              <w:t>—</w:t>
+              <w:t>N/A</w:t>
             </w:r>
           </w:p>
         </w:tc>
@@ -8987,7 +9030,7 @@
                 <w:color w:val="000000"/>
                 <w:sz w:val="19"/>
               </w:rPr>
-              <w:t>—</w:t>
+              <w:t>N/A</w:t>
             </w:r>
           </w:p>
         </w:tc>
@@ -9079,7 +9122,7 @@
                 <w:color w:val="000000"/>
                 <w:sz w:val="19"/>
               </w:rPr>
-              <w:t>—</w:t>
+              <w:t>N/A</w:t>
             </w:r>
           </w:p>
         </w:tc>
@@ -9369,7 +9412,7 @@
       <w:r>
         <w:drawing>
           <wp:inline xmlns:a="http://schemas.openxmlformats.org/drawingml/2006/main" xmlns:pic="http://schemas.openxmlformats.org/drawingml/2006/picture">
-            <wp:extent cx="5897880" cy="7239648"/>
+            <wp:extent cx="4114800" cy="5050917"/>
             <wp:docPr id="4" name="Picture 4" descr="Choropleth map of Alabama census tracts shaded by the percentage of low-income residents beyond the one mile urban or ten mile rural driving-distance threshold, with no-data tracts identified separately." title="Figure 4"/>
             <wp:cNvGraphicFramePr>
               <a:graphicFrameLocks noChangeAspect="1"/>
@@ -9390,7 +9433,7 @@
                   <pic:spPr>
                     <a:xfrm>
                       <a:off x="0" y="0"/>
-                      <a:ext cx="5897880" cy="7239648"/>
+                      <a:ext cx="4114800" cy="5050917"/>
                     </a:xfrm>
                     <a:prstGeom prst="rect"/>
                   </pic:spPr>
@@ -9428,11 +9471,6 @@
           <w:sz w:val="17"/>
         </w:rPr>
         <w:t>Dark shading indicates a larger share of the tract's low-income population beyond the threshold; the map does not show household food-insecurity prevalence.</w:t>
-      </w:r>
-    </w:p>
-    <w:p>
-      <w:r>
-        <w:br w:type="page"/>
       </w:r>
     </w:p>
     <w:p>
@@ -12657,9 +12695,10 @@
       <w:pPr>
         <w:pStyle w:val="Heading1"/>
         <w:keepNext/>
+        <w:pageBreakBefore/>
       </w:pPr>
       <w:r>
-        <w:t>8. Alabama subgroup access</w:t>
+        <w:t>8. Subgroup access results</w:t>
       </w:r>
     </w:p>
     <w:p>
@@ -13679,7 +13718,7 @@
         <w:keepNext/>
       </w:pPr>
       <w:r>
-        <w:t>Alabama sensitivity</w:t>
+        <w:t>Alabama road-network sensitivity</w:t>
       </w:r>
     </w:p>
     <w:tbl>
@@ -13700,11 +13739,10 @@
         </w:tblBorders>
       </w:tblPr>
       <w:tblGrid>
-        <w:gridCol w:w="1700"/>
-        <w:gridCol w:w="2400"/>
-        <w:gridCol w:w="1650"/>
+        <w:gridCol w:w="3100"/>
         <w:gridCol w:w="1900"/>
-        <w:gridCol w:w="1710"/>
+        <w:gridCol w:w="2360"/>
+        <w:gridCol w:w="2000"/>
       </w:tblGrid>
       <w:tr>
         <w:trPr>
@@ -13713,7 +13751,7 @@
         </w:trPr>
         <w:tc>
           <w:tcPr>
-            <w:tcW w:type="dxa" w:w="1700"/>
+            <w:tcW w:type="dxa" w:w="3100"/>
             <w:shd w:fill="F2F4F7"/>
             <w:tcMar>
               <w:top w:w="80" w:type="dxa"/>
@@ -13737,13 +13775,13 @@
                 <w:color w:val="0B2545"/>
                 <w:sz w:val="17"/>
               </w:rPr>
-              <w:t>Method</w:t>
-            </w:r>
-          </w:p>
-        </w:tc>
-        <w:tc>
-          <w:tcPr>
-            <w:tcW w:type="dxa" w:w="2400"/>
+              <w:t>Road-network threshold</w:t>
+            </w:r>
+          </w:p>
+        </w:tc>
+        <w:tc>
+          <w:tcPr>
+            <w:tcW w:type="dxa" w:w="1900"/>
             <w:shd w:fill="F2F4F7"/>
             <w:tcMar>
               <w:top w:w="80" w:type="dxa"/>
@@ -13767,13 +13805,13 @@
                 <w:color w:val="0B2545"/>
                 <w:sz w:val="17"/>
               </w:rPr>
-              <w:t>Threshold</w:t>
-            </w:r>
-          </w:p>
-        </w:tc>
-        <w:tc>
-          <w:tcPr>
-            <w:tcW w:type="dxa" w:w="1650"/>
+              <w:t>All population</w:t>
+            </w:r>
+          </w:p>
+        </w:tc>
+        <w:tc>
+          <w:tcPr>
+            <w:tcW w:type="dxa" w:w="2360"/>
             <w:shd w:fill="F2F4F7"/>
             <w:tcMar>
               <w:top w:w="80" w:type="dxa"/>
@@ -13797,43 +13835,13 @@
                 <w:color w:val="0B2545"/>
                 <w:sz w:val="17"/>
               </w:rPr>
-              <w:t>All population</w:t>
-            </w:r>
-          </w:p>
-        </w:tc>
-        <w:tc>
-          <w:tcPr>
-            <w:tcW w:type="dxa" w:w="1900"/>
-            <w:shd w:fill="F2F4F7"/>
-            <w:tcMar>
-              <w:top w:w="80" w:type="dxa"/>
-              <w:start w:w="120" w:type="dxa"/>
-              <w:bottom w:w="80" w:type="dxa"/>
-              <w:end w:w="120" w:type="dxa"/>
-            </w:tcMar>
-            <w:vAlign w:val="center"/>
-          </w:tcPr>
-          <w:p>
-            <w:pPr>
-              <w:keepLines/>
-              <w:spacing w:before="0" w:after="0" w:line="252" w:lineRule="auto"/>
-              <w:jc w:val="left"/>
-            </w:pPr>
-            <w:r/>
-            <w:r>
-              <w:rPr>
-                <w:rFonts w:ascii="Calibri" w:hAnsi="Calibri"/>
-                <w:b/>
-                <w:color w:val="0B2545"/>
-                <w:sz w:val="17"/>
-              </w:rPr>
               <w:t>Low-income population</w:t>
             </w:r>
           </w:p>
         </w:tc>
         <w:tc>
           <w:tcPr>
-            <w:tcW w:type="dxa" w:w="1710"/>
+            <w:tcW w:type="dxa" w:w="2000"/>
             <w:shd w:fill="F2F4F7"/>
             <w:tcMar>
               <w:top w:w="80" w:type="dxa"/>
@@ -13868,7 +13876,7 @@
         </w:trPr>
         <w:tc>
           <w:tcPr>
-            <w:tcW w:type="dxa" w:w="1700"/>
+            <w:tcW w:type="dxa" w:w="3100"/>
             <w:tcMar>
               <w:top w:w="80" w:type="dxa"/>
               <w:start w:w="120" w:type="dxa"/>
@@ -13891,13 +13899,13 @@
                 <w:color w:val="000000"/>
                 <w:sz w:val="17"/>
               </w:rPr>
-              <w:t>Driving</w:t>
-            </w:r>
-          </w:p>
-        </w:tc>
-        <w:tc>
-          <w:tcPr>
-            <w:tcW w:type="dxa" w:w="2400"/>
+              <w:t>0.5 urban / 10 rural</w:t>
+            </w:r>
+          </w:p>
+        </w:tc>
+        <w:tc>
+          <w:tcPr>
+            <w:tcW w:type="dxa" w:w="1900"/>
             <w:tcMar>
               <w:top w:w="80" w:type="dxa"/>
               <w:start w:w="120" w:type="dxa"/>
@@ -13920,13 +13928,13 @@
                 <w:color w:val="000000"/>
                 <w:sz w:val="17"/>
               </w:rPr>
-              <w:t>0.5 urban / 10 rural</w:t>
-            </w:r>
-          </w:p>
-        </w:tc>
-        <w:tc>
-          <w:tcPr>
-            <w:tcW w:type="dxa" w:w="1650"/>
+              <w:t>34.0%</w:t>
+            </w:r>
+          </w:p>
+        </w:tc>
+        <w:tc>
+          <w:tcPr>
+            <w:tcW w:type="dxa" w:w="2360"/>
             <w:tcMar>
               <w:top w:w="80" w:type="dxa"/>
               <w:start w:w="120" w:type="dxa"/>
@@ -13949,42 +13957,13 @@
                 <w:color w:val="000000"/>
                 <w:sz w:val="17"/>
               </w:rPr>
-              <w:t>34.0%</w:t>
-            </w:r>
-          </w:p>
-        </w:tc>
-        <w:tc>
-          <w:tcPr>
-            <w:tcW w:type="dxa" w:w="1900"/>
-            <w:tcMar>
-              <w:top w:w="80" w:type="dxa"/>
-              <w:start w:w="120" w:type="dxa"/>
-              <w:bottom w:w="80" w:type="dxa"/>
-              <w:end w:w="120" w:type="dxa"/>
-            </w:tcMar>
-            <w:vAlign w:val="center"/>
-          </w:tcPr>
-          <w:p>
-            <w:pPr>
-              <w:keepLines/>
-              <w:spacing w:before="0" w:after="0" w:line="252" w:lineRule="auto"/>
-              <w:jc w:val="left"/>
-            </w:pPr>
-            <w:r/>
-            <w:r>
-              <w:rPr>
-                <w:rFonts w:ascii="Calibri" w:hAnsi="Calibri"/>
-                <w:b w:val="0"/>
-                <w:color w:val="000000"/>
-                <w:sz w:val="17"/>
-              </w:rPr>
               <w:t>35.9%</w:t>
             </w:r>
           </w:p>
         </w:tc>
         <w:tc>
           <w:tcPr>
-            <w:tcW w:type="dxa" w:w="1710"/>
+            <w:tcW w:type="dxa" w:w="2000"/>
             <w:tcMar>
               <w:top w:w="80" w:type="dxa"/>
               <w:start w:w="120" w:type="dxa"/>
@@ -14018,7 +13997,7 @@
         </w:trPr>
         <w:tc>
           <w:tcPr>
-            <w:tcW w:type="dxa" w:w="1700"/>
+            <w:tcW w:type="dxa" w:w="3100"/>
             <w:tcMar>
               <w:top w:w="80" w:type="dxa"/>
               <w:start w:w="120" w:type="dxa"/>
@@ -14041,13 +14020,13 @@
                 <w:color w:val="000000"/>
                 <w:sz w:val="17"/>
               </w:rPr>
-              <w:t>Driving</w:t>
-            </w:r>
-          </w:p>
-        </w:tc>
-        <w:tc>
-          <w:tcPr>
-            <w:tcW w:type="dxa" w:w="2400"/>
+              <w:t>1 urban / 10 rural</w:t>
+            </w:r>
+          </w:p>
+        </w:tc>
+        <w:tc>
+          <w:tcPr>
+            <w:tcW w:type="dxa" w:w="1900"/>
             <w:tcMar>
               <w:top w:w="80" w:type="dxa"/>
               <w:start w:w="120" w:type="dxa"/>
@@ -14070,13 +14049,13 @@
                 <w:color w:val="000000"/>
                 <w:sz w:val="17"/>
               </w:rPr>
-              <w:t>1 urban / 10 rural</w:t>
-            </w:r>
-          </w:p>
-        </w:tc>
-        <w:tc>
-          <w:tcPr>
-            <w:tcW w:type="dxa" w:w="1650"/>
+              <w:t>17.8%</w:t>
+            </w:r>
+          </w:p>
+        </w:tc>
+        <w:tc>
+          <w:tcPr>
+            <w:tcW w:type="dxa" w:w="2360"/>
             <w:tcMar>
               <w:top w:w="80" w:type="dxa"/>
               <w:start w:w="120" w:type="dxa"/>
@@ -14099,42 +14078,13 @@
                 <w:color w:val="000000"/>
                 <w:sz w:val="17"/>
               </w:rPr>
-              <w:t>17.8%</w:t>
-            </w:r>
-          </w:p>
-        </w:tc>
-        <w:tc>
-          <w:tcPr>
-            <w:tcW w:type="dxa" w:w="1900"/>
-            <w:tcMar>
-              <w:top w:w="80" w:type="dxa"/>
-              <w:start w:w="120" w:type="dxa"/>
-              <w:bottom w:w="80" w:type="dxa"/>
-              <w:end w:w="120" w:type="dxa"/>
-            </w:tcMar>
-            <w:vAlign w:val="center"/>
-          </w:tcPr>
-          <w:p>
-            <w:pPr>
-              <w:keepLines/>
-              <w:spacing w:before="0" w:after="0" w:line="252" w:lineRule="auto"/>
-              <w:jc w:val="left"/>
-            </w:pPr>
-            <w:r/>
-            <w:r>
-              <w:rPr>
-                <w:rFonts w:ascii="Calibri" w:hAnsi="Calibri"/>
-                <w:b w:val="0"/>
-                <w:color w:val="000000"/>
-                <w:sz w:val="17"/>
-              </w:rPr>
               <w:t>20.2%</w:t>
             </w:r>
           </w:p>
         </w:tc>
         <w:tc>
           <w:tcPr>
-            <w:tcW w:type="dxa" w:w="1710"/>
+            <w:tcW w:type="dxa" w:w="2000"/>
             <w:tcMar>
               <w:top w:w="80" w:type="dxa"/>
               <w:start w:w="120" w:type="dxa"/>
@@ -14168,7 +14118,7 @@
         </w:trPr>
         <w:tc>
           <w:tcPr>
-            <w:tcW w:type="dxa" w:w="1700"/>
+            <w:tcW w:type="dxa" w:w="3100"/>
             <w:tcMar>
               <w:top w:w="80" w:type="dxa"/>
               <w:start w:w="120" w:type="dxa"/>
@@ -14191,13 +14141,13 @@
                 <w:color w:val="000000"/>
                 <w:sz w:val="17"/>
               </w:rPr>
-              <w:t>Driving</w:t>
-            </w:r>
-          </w:p>
-        </w:tc>
-        <w:tc>
-          <w:tcPr>
-            <w:tcW w:type="dxa" w:w="2400"/>
+              <w:t>1 urban / 20 rural</w:t>
+            </w:r>
+          </w:p>
+        </w:tc>
+        <w:tc>
+          <w:tcPr>
+            <w:tcW w:type="dxa" w:w="1900"/>
             <w:tcMar>
               <w:top w:w="80" w:type="dxa"/>
               <w:start w:w="120" w:type="dxa"/>
@@ -14220,13 +14170,13 @@
                 <w:color w:val="000000"/>
                 <w:sz w:val="17"/>
               </w:rPr>
-              <w:t>1 urban / 20 rural</w:t>
-            </w:r>
-          </w:p>
-        </w:tc>
-        <w:tc>
-          <w:tcPr>
-            <w:tcW w:type="dxa" w:w="1650"/>
+              <w:t>17.1%</w:t>
+            </w:r>
+          </w:p>
+        </w:tc>
+        <w:tc>
+          <w:tcPr>
+            <w:tcW w:type="dxa" w:w="2360"/>
             <w:tcMar>
               <w:top w:w="80" w:type="dxa"/>
               <w:start w:w="120" w:type="dxa"/>
@@ -14249,13 +14199,13 @@
                 <w:color w:val="000000"/>
                 <w:sz w:val="17"/>
               </w:rPr>
-              <w:t>17.1%</w:t>
-            </w:r>
-          </w:p>
-        </w:tc>
-        <w:tc>
-          <w:tcPr>
-            <w:tcW w:type="dxa" w:w="1900"/>
+              <w:t>19.6%</w:t>
+            </w:r>
+          </w:p>
+        </w:tc>
+        <w:tc>
+          <w:tcPr>
+            <w:tcW w:type="dxa" w:w="2000"/>
             <w:tcMar>
               <w:top w:w="80" w:type="dxa"/>
               <w:start w:w="120" w:type="dxa"/>
@@ -14278,186 +14228,7 @@
                 <w:color w:val="000000"/>
                 <w:sz w:val="17"/>
               </w:rPr>
-              <w:t>19.6%</w:t>
-            </w:r>
-          </w:p>
-        </w:tc>
-        <w:tc>
-          <w:tcPr>
-            <w:tcW w:type="dxa" w:w="1710"/>
-            <w:tcMar>
-              <w:top w:w="80" w:type="dxa"/>
-              <w:start w:w="120" w:type="dxa"/>
-              <w:bottom w:w="80" w:type="dxa"/>
-              <w:end w:w="120" w:type="dxa"/>
-            </w:tcMar>
-            <w:vAlign w:val="center"/>
-          </w:tcPr>
-          <w:p>
-            <w:pPr>
-              <w:keepLines/>
-              <w:spacing w:before="0" w:after="0" w:line="252" w:lineRule="auto"/>
-              <w:jc w:val="left"/>
-            </w:pPr>
-            <w:r/>
-            <w:r>
-              <w:rPr>
-                <w:rFonts w:ascii="Calibri" w:hAnsi="Calibri"/>
-                <w:b w:val="0"/>
-                <w:color w:val="000000"/>
-                <w:sz w:val="17"/>
-              </w:rPr>
               <w:t>9.7%</w:t>
-            </w:r>
-          </w:p>
-        </w:tc>
-      </w:tr>
-      <w:tr>
-        <w:trPr>
-          <w:cantSplit/>
-        </w:trPr>
-        <w:tc>
-          <w:tcPr>
-            <w:tcW w:type="dxa" w:w="1700"/>
-            <w:tcMar>
-              <w:top w:w="80" w:type="dxa"/>
-              <w:start w:w="120" w:type="dxa"/>
-              <w:bottom w:w="80" w:type="dxa"/>
-              <w:end w:w="120" w:type="dxa"/>
-            </w:tcMar>
-            <w:vAlign w:val="center"/>
-          </w:tcPr>
-          <w:p>
-            <w:pPr>
-              <w:keepLines/>
-              <w:spacing w:before="0" w:after="0" w:line="252" w:lineRule="auto"/>
-              <w:jc w:val="left"/>
-            </w:pPr>
-            <w:r/>
-            <w:r>
-              <w:rPr>
-                <w:rFonts w:ascii="Calibri" w:hAnsi="Calibri"/>
-                <w:b w:val="0"/>
-                <w:color w:val="000000"/>
-                <w:sz w:val="17"/>
-              </w:rPr>
-              <w:t>Straight line</w:t>
-            </w:r>
-          </w:p>
-        </w:tc>
-        <w:tc>
-          <w:tcPr>
-            <w:tcW w:type="dxa" w:w="2400"/>
-            <w:tcMar>
-              <w:top w:w="80" w:type="dxa"/>
-              <w:start w:w="120" w:type="dxa"/>
-              <w:bottom w:w="80" w:type="dxa"/>
-              <w:end w:w="120" w:type="dxa"/>
-            </w:tcMar>
-            <w:vAlign w:val="center"/>
-          </w:tcPr>
-          <w:p>
-            <w:pPr>
-              <w:keepLines/>
-              <w:spacing w:before="0" w:after="0" w:line="252" w:lineRule="auto"/>
-              <w:jc w:val="left"/>
-            </w:pPr>
-            <w:r/>
-            <w:r>
-              <w:rPr>
-                <w:rFonts w:ascii="Calibri" w:hAnsi="Calibri"/>
-                <w:b w:val="0"/>
-                <w:color w:val="000000"/>
-                <w:sz w:val="17"/>
-              </w:rPr>
-              <w:t>1 urban / 10 rural</w:t>
-            </w:r>
-          </w:p>
-        </w:tc>
-        <w:tc>
-          <w:tcPr>
-            <w:tcW w:type="dxa" w:w="1650"/>
-            <w:tcMar>
-              <w:top w:w="80" w:type="dxa"/>
-              <w:start w:w="120" w:type="dxa"/>
-              <w:bottom w:w="80" w:type="dxa"/>
-              <w:end w:w="120" w:type="dxa"/>
-            </w:tcMar>
-            <w:vAlign w:val="center"/>
-          </w:tcPr>
-          <w:p>
-            <w:pPr>
-              <w:keepLines/>
-              <w:spacing w:before="0" w:after="0" w:line="252" w:lineRule="auto"/>
-              <w:jc w:val="left"/>
-            </w:pPr>
-            <w:r/>
-            <w:r>
-              <w:rPr>
-                <w:rFonts w:ascii="Calibri" w:hAnsi="Calibri"/>
-                <w:b w:val="0"/>
-                <w:color w:val="000000"/>
-                <w:sz w:val="17"/>
-              </w:rPr>
-              <w:t>7.3%</w:t>
-            </w:r>
-          </w:p>
-        </w:tc>
-        <w:tc>
-          <w:tcPr>
-            <w:tcW w:type="dxa" w:w="1900"/>
-            <w:tcMar>
-              <w:top w:w="80" w:type="dxa"/>
-              <w:start w:w="120" w:type="dxa"/>
-              <w:bottom w:w="80" w:type="dxa"/>
-              <w:end w:w="120" w:type="dxa"/>
-            </w:tcMar>
-            <w:vAlign w:val="center"/>
-          </w:tcPr>
-          <w:p>
-            <w:pPr>
-              <w:keepLines/>
-              <w:spacing w:before="0" w:after="0" w:line="252" w:lineRule="auto"/>
-              <w:jc w:val="left"/>
-            </w:pPr>
-            <w:r/>
-            <w:r>
-              <w:rPr>
-                <w:rFonts w:ascii="Calibri" w:hAnsi="Calibri"/>
-                <w:b w:val="0"/>
-                <w:color w:val="000000"/>
-                <w:sz w:val="17"/>
-              </w:rPr>
-              <w:t>8.6%</w:t>
-            </w:r>
-          </w:p>
-        </w:tc>
-        <w:tc>
-          <w:tcPr>
-            <w:tcW w:type="dxa" w:w="1710"/>
-            <w:tcMar>
-              <w:top w:w="80" w:type="dxa"/>
-              <w:start w:w="120" w:type="dxa"/>
-              <w:bottom w:w="80" w:type="dxa"/>
-              <w:end w:w="120" w:type="dxa"/>
-            </w:tcMar>
-            <w:vAlign w:val="center"/>
-          </w:tcPr>
-          <w:p>
-            <w:pPr>
-              <w:keepLines/>
-              <w:spacing w:before="0" w:after="0" w:line="252" w:lineRule="auto"/>
-              <w:jc w:val="left"/>
-            </w:pPr>
-            <w:r/>
-            <w:r>
-              <w:rPr>
-                <w:rFonts w:ascii="Calibri" w:hAnsi="Calibri"/>
-                <w:b w:val="0"/>
-                <w:color w:val="000000"/>
-                <w:sz w:val="17"/>
-              </w:rPr>
-              <w:t>3.6%</w:t>
             </w:r>
           </w:p>
         </w:tc>
@@ -14517,7 +14288,7 @@
           <w:color w:val="000000"/>
           <w:sz w:val="22"/>
         </w:rPr>
-        <w:t>Replacing driving distance with straight-line distance lowers the result from 20.2% to 8.6%.</w:t>
+        <w:t>Straight-line distance is excluded from the study and is not treated as a sensitivity result.</w:t>
       </w:r>
     </w:p>
     <w:p>
@@ -14536,7 +14307,7 @@
           <w:color w:val="000000"/>
           <w:sz w:val="22"/>
         </w:rPr>
-        <w:t>Recommendation: retain the network 1/10 threshold and label the method on every table, chart, and spoken finding.</w:t>
+        <w:t>Recommendation: retain the road-network 1/10 threshold and label it on every table, chart, and spoken finding.</w:t>
       </w:r>
     </w:p>
     <w:p>
@@ -14840,7 +14611,7 @@
                 <w:color w:val="000000"/>
                 <w:sz w:val="14"/>
               </w:rPr>
-              <w:t>—</w:t>
+              <w:t>N/A</w:t>
             </w:r>
           </w:p>
         </w:tc>
@@ -14961,7 +14732,7 @@
                 <w:color w:val="000000"/>
                 <w:sz w:val="14"/>
               </w:rPr>
-              <w:t>—</w:t>
+              <w:t>N/A</w:t>
             </w:r>
           </w:p>
         </w:tc>
@@ -15082,7 +14853,7 @@
                 <w:color w:val="000000"/>
                 <w:sz w:val="14"/>
               </w:rPr>
-              <w:t>—</w:t>
+              <w:t>N/A</w:t>
             </w:r>
           </w:p>
         </w:tc>
@@ -15324,7 +15095,7 @@
                 <w:color w:val="000000"/>
                 <w:sz w:val="14"/>
               </w:rPr>
-              <w:t>—</w:t>
+              <w:t>N/A</w:t>
             </w:r>
           </w:p>
         </w:tc>
@@ -15445,7 +15216,7 @@
                 <w:color w:val="000000"/>
                 <w:sz w:val="14"/>
               </w:rPr>
-              <w:t>—</w:t>
+              <w:t>N/A</w:t>
             </w:r>
           </w:p>
         </w:tc>
@@ -15566,7 +15337,7 @@
                 <w:color w:val="000000"/>
                 <w:sz w:val="14"/>
               </w:rPr>
-              <w:t>—</w:t>
+              <w:t>N/A</w:t>
             </w:r>
           </w:p>
         </w:tc>
@@ -15687,7 +15458,7 @@
                 <w:color w:val="000000"/>
                 <w:sz w:val="14"/>
               </w:rPr>
-              <w:t>—</w:t>
+              <w:t>N/A</w:t>
             </w:r>
           </w:p>
         </w:tc>
@@ -15808,7 +15579,7 @@
                 <w:color w:val="000000"/>
                 <w:sz w:val="14"/>
               </w:rPr>
-              <w:t>—</w:t>
+              <w:t>N/A</w:t>
             </w:r>
           </w:p>
         </w:tc>
@@ -15929,7 +15700,7 @@
                 <w:color w:val="000000"/>
                 <w:sz w:val="14"/>
               </w:rPr>
-              <w:t>—</w:t>
+              <w:t>N/A</w:t>
             </w:r>
           </w:p>
         </w:tc>
@@ -16050,7 +15821,7 @@
                 <w:color w:val="000000"/>
                 <w:sz w:val="14"/>
               </w:rPr>
-              <w:t>—</w:t>
+              <w:t>N/A</w:t>
             </w:r>
           </w:p>
         </w:tc>
@@ -16292,7 +16063,7 @@
                 <w:color w:val="000000"/>
                 <w:sz w:val="14"/>
               </w:rPr>
-              <w:t>—</w:t>
+              <w:t>N/A</w:t>
             </w:r>
           </w:p>
         </w:tc>
@@ -17318,6 +17089,127 @@
                 <w:sz w:val="15"/>
               </w:rPr>
               <w:t>Do not add broadly; retain only variables with a specific analytical purpose.</w:t>
+            </w:r>
+          </w:p>
+        </w:tc>
+      </w:tr>
+      <w:tr>
+        <w:trPr>
+          <w:cantSplit/>
+        </w:trPr>
+        <w:tc>
+          <w:tcPr>
+            <w:tcW w:type="dxa" w:w="1850"/>
+            <w:tcMar>
+              <w:top w:w="80" w:type="dxa"/>
+              <w:start w:w="120" w:type="dxa"/>
+              <w:bottom w:w="80" w:type="dxa"/>
+              <w:end w:w="120" w:type="dxa"/>
+            </w:tcMar>
+            <w:vAlign w:val="center"/>
+          </w:tcPr>
+          <w:p>
+            <w:pPr>
+              <w:keepLines/>
+              <w:spacing w:before="0" w:after="0" w:line="252" w:lineRule="auto"/>
+              <w:jc w:val="left"/>
+            </w:pPr>
+            <w:r/>
+            <w:r>
+              <w:rPr>
+                <w:rFonts w:ascii="Calibri" w:hAnsi="Calibri"/>
+                <w:b w:val="0"/>
+                <w:color w:val="000000"/>
+                <w:sz w:val="15"/>
+              </w:rPr>
+              <w:t>FEEDING_AMERICA_AL_2024</w:t>
+            </w:r>
+          </w:p>
+        </w:tc>
+        <w:tc>
+          <w:tcPr>
+            <w:tcW w:type="dxa" w:w="1800"/>
+            <w:tcMar>
+              <w:top w:w="80" w:type="dxa"/>
+              <w:start w:w="120" w:type="dxa"/>
+              <w:bottom w:w="80" w:type="dxa"/>
+              <w:end w:w="120" w:type="dxa"/>
+            </w:tcMar>
+            <w:vAlign w:val="center"/>
+          </w:tcPr>
+          <w:p>
+            <w:pPr>
+              <w:keepLines/>
+              <w:spacing w:before="0" w:after="0" w:line="252" w:lineRule="auto"/>
+              <w:jc w:val="left"/>
+            </w:pPr>
+            <w:r/>
+            <w:r>
+              <w:rPr>
+                <w:rFonts w:ascii="Calibri" w:hAnsi="Calibri"/>
+                <w:b w:val="0"/>
+                <w:color w:val="000000"/>
+                <w:sz w:val="15"/>
+              </w:rPr>
+              <w:t>Unconfirmed</w:t>
+            </w:r>
+          </w:p>
+        </w:tc>
+        <w:tc>
+          <w:tcPr>
+            <w:tcW w:type="dxa" w:w="2400"/>
+            <w:tcMar>
+              <w:top w:w="80" w:type="dxa"/>
+              <w:start w:w="120" w:type="dxa"/>
+              <w:bottom w:w="80" w:type="dxa"/>
+              <w:end w:w="120" w:type="dxa"/>
+            </w:tcMar>
+            <w:vAlign w:val="center"/>
+          </w:tcPr>
+          <w:p>
+            <w:pPr>
+              <w:keepLines/>
+              <w:spacing w:before="0" w:after="0" w:line="252" w:lineRule="auto"/>
+              <w:jc w:val="left"/>
+            </w:pPr>
+            <w:r/>
+            <w:r>
+              <w:rPr>
+                <w:rFonts w:ascii="Calibri" w:hAnsi="Calibri"/>
+                <w:b w:val="0"/>
+                <w:color w:val="000000"/>
+                <w:sz w:val="15"/>
+              </w:rPr>
+              <w:t>HOLD - validation required</w:t>
+            </w:r>
+          </w:p>
+        </w:tc>
+        <w:tc>
+          <w:tcPr>
+            <w:tcW w:type="dxa" w:w="3310"/>
+            <w:tcMar>
+              <w:top w:w="80" w:type="dxa"/>
+              <w:start w:w="120" w:type="dxa"/>
+              <w:bottom w:w="80" w:type="dxa"/>
+              <w:end w:w="120" w:type="dxa"/>
+            </w:tcMar>
+            <w:vAlign w:val="center"/>
+          </w:tcPr>
+          <w:p>
+            <w:pPr>
+              <w:keepLines/>
+              <w:spacing w:before="0" w:after="0" w:line="252" w:lineRule="auto"/>
+              <w:jc w:val="left"/>
+            </w:pPr>
+            <w:r/>
+            <w:r>
+              <w:rPr>
+                <w:rFonts w:ascii="Calibri" w:hAnsi="Calibri"/>
+                <w:b w:val="0"/>
+                <w:color w:val="000000"/>
+                <w:sz w:val="15"/>
+              </w:rPr>
+              <w:t>Meeting notes report a retrieved map, but the repository lacks the source file, direct citation, definitions, denominator, geography, license, and reconciliation record.</w:t>
             </w:r>
           </w:p>
         </w:tc>
@@ -17553,6 +17445,25 @@
           <w:color w:val="000000"/>
           <w:sz w:val="22"/>
         </w:rPr>
+        <w:t>Hold the 2024 Feeding America Alabama data until the source file, direct citation, field definitions, denominator, geography, license, and Alabama reconciliation are documented.</w:t>
+      </w:r>
+    </w:p>
+    <w:p>
+      <w:pPr>
+        <w:keepLines/>
+        <w:numPr>
+          <w:ilvl w:val="0"/>
+          <w:numId w:val="10"/>
+        </w:numPr>
+        <w:spacing w:before="0" w:after="80" w:line="280" w:lineRule="auto"/>
+        <w:ind w:left="720" w:hanging="360"/>
+      </w:pPr>
+      <w:r>
+        <w:rPr>
+          <w:rFonts w:ascii="Calibri" w:hAnsi="Calibri"/>
+          <w:color w:val="000000"/>
+          <w:sz w:val="22"/>
+        </w:rPr>
         <w:t>Preserve the current frozen pull. Refresh only with a new dated snapshot and a change log.</w:t>
       </w:r>
     </w:p>
@@ -17623,8 +17534,41 @@
       </w:r>
     </w:p>
     <w:p>
+      <w:pPr>
+        <w:keepLines/>
+        <w:numPr>
+          <w:ilvl w:val="0"/>
+          <w:numId w:val="10"/>
+        </w:numPr>
+        <w:spacing w:before="0" w:after="80" w:line="280" w:lineRule="auto"/>
+        <w:ind w:left="720" w:hanging="360"/>
+      </w:pPr>
       <w:r>
-        <w:br w:type="page"/>
+        <w:rPr>
+          <w:rFonts w:ascii="Calibri" w:hAnsi="Calibri"/>
+          <w:color w:val="000000"/>
+          <w:sz w:val="22"/>
+        </w:rPr>
+        <w:t>The current data does not quantify food abundance or supply volume. That visual requires an approved measure and source.</w:t>
+      </w:r>
+    </w:p>
+    <w:p>
+      <w:pPr>
+        <w:keepLines/>
+        <w:numPr>
+          <w:ilvl w:val="0"/>
+          <w:numId w:val="10"/>
+        </w:numPr>
+        <w:spacing w:before="0" w:after="80" w:line="280" w:lineRule="auto"/>
+        <w:ind w:left="720" w:hanging="360"/>
+      </w:pPr>
+      <w:r>
+        <w:rPr>
+          <w:rFonts w:ascii="Calibri" w:hAnsi="Calibri"/>
+          <w:color w:val="000000"/>
+          <w:sz w:val="22"/>
+        </w:rPr>
+        <w:t>Race and gender demographic analysis is outside the current scope.</w:t>
       </w:r>
     </w:p>
     <w:p>
@@ -18604,7 +18548,7 @@
                 <w:color w:val="172B44"/>
                 <w:sz w:val="18"/>
               </w:rPr>
-              <w:t>Conduct an official-source-only feasibility crawl for food-allergy access in Alabama and the project-defined Southeast (AL, AR, FL, GA, KY, LA, MS, NC, SC, TN). Keep this separate from the current food-access analysis until joinability is proven. Use the FDA nine major allergens—milk, egg, fish, crustacean shellfish, tree nuts, peanuts, wheat, soybeans, and sesame—as the primary taxonomy. Treat fruit and chocolate only as explicitly defined exploratory categories. For each candidate dataset, record publisher, exact dataset and table, URL/API endpoint, release and observation dates, population or product universe, geography, unit of analysis, allergen fields, price/inventory fields, identifiers, access/licensing limits, update frequency, missingness, and proposed joins. Prioritize CDC/NCHS 2024 NHIS for diagnosed prevalence, USDA FoodData Central branded foods for a pilot of ingredient/Contains-text classification, and openFDA food-enforcement data for undeclared-allergen recall events. Do not treat recalls as prevalence or FoodData Central as store inventory. Do not make causal or medical claims and do not collect personal health information. Sanity-check denominators, duplicate records, changing labels, geography, dates, and taxonomy. Deliver (1) a source inventory, (2) a field-level data dictionary, (3) small reproducible pilot extracts, (4) QA findings, (5) a joinability matrix, and (6) a proceed/pause recommendation. Proceed to local allergen-safe access only if a product-by-store-by-date source with price and defensible coverage is available; otherwise recommend separate descriptive modules and identify the exact missing data.</w:t>
+              <w:t>Conduct an official-source-only feasibility crawl for food-allergy access in Alabama and the project-defined Southeast (AL, AR, FL, GA, KY, LA, MS, NC, SC, TN). Keep this separate from the current food-access analysis until joinability is proven. Use the FDA nine major allergens, including milk, egg, fish, crustacean shellfish, tree nuts, peanuts, wheat, soybeans, and sesame, as the primary taxonomy. Treat fruit and chocolate only as explicitly defined exploratory categories. For each candidate dataset, record publisher, exact dataset and table, URL/API endpoint, release and observation dates, population or product universe, geography, unit of analysis, allergen fields, price/inventory fields, identifiers, access/licensing limits, update frequency, missingness, and proposed joins. Prioritize CDC/NCHS 2024 NHIS for diagnosed prevalence, USDA FoodData Central branded foods for a pilot of ingredient/Contains-text classification, and openFDA food-enforcement data for undeclared-allergen recall events. Do not treat recalls as prevalence or FoodData Central as store inventory. Do not make causal or medical claims and do not collect personal health information. Sanity-check denominators, duplicate records, changing labels, geography, dates, and taxonomy. Deliver (1) a source inventory, (2) a field-level data dictionary, (3) small reproducible pilot extracts, (4) QA findings, (5) a joinability matrix, and (6) a proceed/pause recommendation. Proceed to local allergen-safe access only if a product-by-store-by-date source with price and defensible coverage is available; otherwise recommend separate descriptive modules and identify the exact missing data.</w:t>
             </w:r>
           </w:p>
         </w:tc>
@@ -19289,7 +19233,45 @@
           <w:color w:val="000000"/>
           <w:sz w:val="22"/>
         </w:rPr>
-        <w:t>Driving and straight-line results differ materially; method choice must be disclosed.</w:t>
+        <w:t>Straight-line distance is excluded; road-network thresholds must be disclosed.</w:t>
+      </w:r>
+    </w:p>
+    <w:p>
+      <w:pPr>
+        <w:keepLines/>
+        <w:numPr>
+          <w:ilvl w:val="0"/>
+          <w:numId w:val="10"/>
+        </w:numPr>
+        <w:spacing w:before="0" w:after="80" w:line="280" w:lineRule="auto"/>
+        <w:ind w:left="720" w:hanging="360"/>
+      </w:pPr>
+      <w:r>
+        <w:rPr>
+          <w:rFonts w:ascii="Calibri" w:hAnsi="Calibri"/>
+          <w:color w:val="000000"/>
+          <w:sz w:val="22"/>
+        </w:rPr>
+        <w:t>The current data does not quantify food abundance or supply volume.</w:t>
+      </w:r>
+    </w:p>
+    <w:p>
+      <w:pPr>
+        <w:keepLines/>
+        <w:numPr>
+          <w:ilvl w:val="0"/>
+          <w:numId w:val="10"/>
+        </w:numPr>
+        <w:spacing w:before="0" w:after="80" w:line="280" w:lineRule="auto"/>
+        <w:ind w:left="720" w:hanging="360"/>
+      </w:pPr>
+      <w:r>
+        <w:rPr>
+          <w:rFonts w:ascii="Calibri" w:hAnsi="Calibri"/>
+          <w:color w:val="000000"/>
+          <w:sz w:val="22"/>
+        </w:rPr>
+        <w:t>Race and gender demographic analysis is outside the current scope.</w:t>
       </w:r>
     </w:p>
     <w:p>
@@ -19921,6 +19903,7 @@
       <w:pPr>
         <w:pStyle w:val="Heading1"/>
         <w:keepNext/>
+        <w:pageBreakBefore/>
       </w:pPr>
       <w:r>
         <w:t>Appendix C. Official sources</w:t>
@@ -20074,7 +20057,7 @@
             <w:u w:val="single"/>
             <w:rFonts w:ascii="Calibri" w:hAnsi="Calibri"/>
           </w:rPr>
-          <w:t>Food Access Research Atlas — Download the Data</w:t>
+          <w:t>Food Access Research Atlas - Download the Data</w:t>
         </w:r>
       </w:hyperlink>
       <w:r>
@@ -20719,7 +20702,7 @@
                 <w:color w:val="000000"/>
                 <w:sz w:val="18"/>
               </w:rPr>
-              <w:t>Driving-distance sensitivity disclosed</w:t>
+              <w:t>Road-network sensitivity disclosed</w:t>
             </w:r>
           </w:p>
         </w:tc>
@@ -20782,7 +20765,7 @@
                 <w:color w:val="000000"/>
                 <w:sz w:val="18"/>
               </w:rPr>
-              <w:t>Source hashes and retrieval dates captured</w:t>
+              <w:t>Straight-line result excluded</w:t>
             </w:r>
           </w:p>
         </w:tc>
@@ -20845,7 +20828,7 @@
                 <w:color w:val="000000"/>
                 <w:sz w:val="18"/>
               </w:rPr>
-              <w:t>Blocking QA failures</w:t>
+              <w:t>Source hashes and retrieval dates captured</w:t>
             </w:r>
           </w:p>
         </w:tc>
@@ -20874,7 +20857,7 @@
                 <w:color w:val="000000"/>
                 <w:sz w:val="18"/>
               </w:rPr>
-              <w:t>None</w:t>
+              <w:t>Yes</w:t>
             </w:r>
           </w:p>
         </w:tc>
@@ -20908,6 +20891,69 @@
                 <w:color w:val="000000"/>
                 <w:sz w:val="18"/>
               </w:rPr>
+              <w:t>Blocking QA failures</w:t>
+            </w:r>
+          </w:p>
+        </w:tc>
+        <w:tc>
+          <w:tcPr>
+            <w:tcW w:type="dxa" w:w="2760"/>
+            <w:tcMar>
+              <w:top w:w="80" w:type="dxa"/>
+              <w:start w:w="120" w:type="dxa"/>
+              <w:bottom w:w="80" w:type="dxa"/>
+              <w:end w:w="120" w:type="dxa"/>
+            </w:tcMar>
+            <w:vAlign w:val="center"/>
+          </w:tcPr>
+          <w:p>
+            <w:pPr>
+              <w:keepLines/>
+              <w:spacing w:before="0" w:after="0" w:line="252" w:lineRule="auto"/>
+              <w:jc w:val="left"/>
+            </w:pPr>
+            <w:r/>
+            <w:r>
+              <w:rPr>
+                <w:rFonts w:ascii="Calibri" w:hAnsi="Calibri"/>
+                <w:b w:val="0"/>
+                <w:color w:val="000000"/>
+                <w:sz w:val="18"/>
+              </w:rPr>
+              <w:t>None</w:t>
+            </w:r>
+          </w:p>
+        </w:tc>
+      </w:tr>
+      <w:tr>
+        <w:trPr>
+          <w:cantSplit/>
+        </w:trPr>
+        <w:tc>
+          <w:tcPr>
+            <w:tcW w:type="dxa" w:w="6600"/>
+            <w:tcMar>
+              <w:top w:w="80" w:type="dxa"/>
+              <w:start w:w="120" w:type="dxa"/>
+              <w:bottom w:w="80" w:type="dxa"/>
+              <w:end w:w="120" w:type="dxa"/>
+            </w:tcMar>
+            <w:vAlign w:val="center"/>
+          </w:tcPr>
+          <w:p>
+            <w:pPr>
+              <w:keepLines/>
+              <w:spacing w:before="0" w:after="0" w:line="252" w:lineRule="auto"/>
+              <w:jc w:val="left"/>
+            </w:pPr>
+            <w:r/>
+            <w:r>
+              <w:rPr>
+                <w:rFonts w:ascii="Calibri" w:hAnsi="Calibri"/>
+                <w:b w:val="0"/>
+                <w:color w:val="000000"/>
+                <w:sz w:val="18"/>
+              </w:rPr>
               <w:t>Allergy integration</w:t>
             </w:r>
           </w:p>
@@ -20938,6 +20984,370 @@
                 <w:sz w:val="18"/>
               </w:rPr>
               <w:t>Paused pending feasibility gate</w:t>
+            </w:r>
+          </w:p>
+        </w:tc>
+      </w:tr>
+    </w:tbl>
+    <w:p>
+      <w:pPr>
+        <w:pStyle w:val="Heading1"/>
+        <w:keepNext/>
+        <w:pageBreakBefore/>
+      </w:pPr>
+      <w:r>
+        <w:t>Appendix E. Project roles</w:t>
+      </w:r>
+    </w:p>
+    <w:p>
+      <w:pPr>
+        <w:spacing w:before="0" w:after="120" w:line="264" w:lineRule="auto"/>
+      </w:pPr>
+      <w:r>
+        <w:rPr>
+          <w:rFonts w:ascii="Calibri" w:hAnsi="Calibri"/>
+          <w:i w:val="0"/>
+          <w:color w:val="000000"/>
+          <w:sz w:val="22"/>
+        </w:rPr>
+        <w:t>Roles are placed at the end so readers encounter the project question, methods, evidence, and limitations first.</w:t>
+      </w:r>
+    </w:p>
+    <w:tbl>
+      <w:tblPr>
+        <w:tblStyle w:val="TableGrid"/>
+        <w:tblW w:type="dxa" w:w="9360"/>
+        <w:jc w:val="left"/>
+        <w:tblLayout w:type="fixed"/>
+        <w:tblLook w:firstColumn="1" w:firstRow="1" w:lastColumn="0" w:lastRow="0" w:noHBand="0" w:noVBand="1" w:val="04A0"/>
+        <w:tblInd w:w="120" w:type="dxa"/>
+        <w:tblBorders>
+          <w:top w:val="single" w:sz="6" w:space="0" w:color="CBD2DA"/>
+          <w:left w:val="single" w:sz="6" w:space="0" w:color="CBD2DA"/>
+          <w:bottom w:val="single" w:sz="6" w:space="0" w:color="CBD2DA"/>
+          <w:right w:val="single" w:sz="6" w:space="0" w:color="CBD2DA"/>
+          <w:insideH w:val="single" w:sz="6" w:space="0" w:color="CBD2DA"/>
+          <w:insideV w:val="single" w:sz="6" w:space="0" w:color="CBD2DA"/>
+        </w:tblBorders>
+      </w:tblPr>
+      <w:tblGrid>
+        <w:gridCol w:w="2500"/>
+        <w:gridCol w:w="6860"/>
+      </w:tblGrid>
+      <w:tr>
+        <w:trPr>
+          <w:tblHeader w:val="true"/>
+          <w:cantSplit/>
+        </w:trPr>
+        <w:tc>
+          <w:tcPr>
+            <w:tcW w:type="dxa" w:w="2500"/>
+            <w:shd w:fill="F2F4F7"/>
+            <w:tcMar>
+              <w:top w:w="80" w:type="dxa"/>
+              <w:start w:w="120" w:type="dxa"/>
+              <w:bottom w:w="80" w:type="dxa"/>
+              <w:end w:w="120" w:type="dxa"/>
+            </w:tcMar>
+            <w:vAlign w:val="center"/>
+          </w:tcPr>
+          <w:p>
+            <w:pPr>
+              <w:keepLines/>
+              <w:spacing w:before="0" w:after="0" w:line="252" w:lineRule="auto"/>
+              <w:jc w:val="left"/>
+            </w:pPr>
+            <w:r/>
+            <w:r>
+              <w:rPr>
+                <w:rFonts w:ascii="Calibri" w:hAnsi="Calibri"/>
+                <w:b/>
+                <w:color w:val="0B2545"/>
+                <w:sz w:val="18"/>
+              </w:rPr>
+              <w:t>Team member</w:t>
+            </w:r>
+          </w:p>
+        </w:tc>
+        <w:tc>
+          <w:tcPr>
+            <w:tcW w:type="dxa" w:w="6860"/>
+            <w:shd w:fill="F2F4F7"/>
+            <w:tcMar>
+              <w:top w:w="80" w:type="dxa"/>
+              <w:start w:w="120" w:type="dxa"/>
+              <w:bottom w:w="80" w:type="dxa"/>
+              <w:end w:w="120" w:type="dxa"/>
+            </w:tcMar>
+            <w:vAlign w:val="center"/>
+          </w:tcPr>
+          <w:p>
+            <w:pPr>
+              <w:keepLines/>
+              <w:spacing w:before="0" w:after="0" w:line="252" w:lineRule="auto"/>
+              <w:jc w:val="left"/>
+            </w:pPr>
+            <w:r/>
+            <w:r>
+              <w:rPr>
+                <w:rFonts w:ascii="Calibri" w:hAnsi="Calibri"/>
+                <w:b/>
+                <w:color w:val="0B2545"/>
+                <w:sz w:val="18"/>
+              </w:rPr>
+              <w:t>Primary responsibilities</w:t>
+            </w:r>
+          </w:p>
+        </w:tc>
+      </w:tr>
+      <w:tr>
+        <w:trPr>
+          <w:cantSplit/>
+        </w:trPr>
+        <w:tc>
+          <w:tcPr>
+            <w:tcW w:type="dxa" w:w="2500"/>
+            <w:tcMar>
+              <w:top w:w="80" w:type="dxa"/>
+              <w:start w:w="120" w:type="dxa"/>
+              <w:bottom w:w="80" w:type="dxa"/>
+              <w:end w:w="120" w:type="dxa"/>
+            </w:tcMar>
+            <w:vAlign w:val="center"/>
+          </w:tcPr>
+          <w:p>
+            <w:pPr>
+              <w:keepLines/>
+              <w:spacing w:before="0" w:after="0" w:line="252" w:lineRule="auto"/>
+              <w:jc w:val="left"/>
+            </w:pPr>
+            <w:r/>
+            <w:r>
+              <w:rPr>
+                <w:rFonts w:ascii="Calibri" w:hAnsi="Calibri"/>
+                <w:b w:val="0"/>
+                <w:color w:val="000000"/>
+                <w:sz w:val="18"/>
+              </w:rPr>
+              <w:t>Sharon Brooks</w:t>
+            </w:r>
+          </w:p>
+        </w:tc>
+        <w:tc>
+          <w:tcPr>
+            <w:tcW w:type="dxa" w:w="6860"/>
+            <w:tcMar>
+              <w:top w:w="80" w:type="dxa"/>
+              <w:start w:w="120" w:type="dxa"/>
+              <w:bottom w:w="80" w:type="dxa"/>
+              <w:end w:w="120" w:type="dxa"/>
+            </w:tcMar>
+            <w:vAlign w:val="center"/>
+          </w:tcPr>
+          <w:p>
+            <w:pPr>
+              <w:keepLines/>
+              <w:spacing w:before="0" w:after="0" w:line="252" w:lineRule="auto"/>
+              <w:jc w:val="left"/>
+            </w:pPr>
+            <w:r/>
+            <w:r>
+              <w:rPr>
+                <w:rFonts w:ascii="Calibri" w:hAnsi="Calibri"/>
+                <w:b w:val="0"/>
+                <w:color w:val="000000"/>
+                <w:sz w:val="18"/>
+              </w:rPr>
+              <w:t>Team lead and project management, meeting coordination, and review of the repository framework.</w:t>
+            </w:r>
+          </w:p>
+        </w:tc>
+      </w:tr>
+      <w:tr>
+        <w:trPr>
+          <w:cantSplit/>
+        </w:trPr>
+        <w:tc>
+          <w:tcPr>
+            <w:tcW w:type="dxa" w:w="2500"/>
+            <w:tcMar>
+              <w:top w:w="80" w:type="dxa"/>
+              <w:start w:w="120" w:type="dxa"/>
+              <w:bottom w:w="80" w:type="dxa"/>
+              <w:end w:w="120" w:type="dxa"/>
+            </w:tcMar>
+            <w:vAlign w:val="center"/>
+          </w:tcPr>
+          <w:p>
+            <w:pPr>
+              <w:keepLines/>
+              <w:spacing w:before="0" w:after="0" w:line="252" w:lineRule="auto"/>
+              <w:jc w:val="left"/>
+            </w:pPr>
+            <w:r/>
+            <w:r>
+              <w:rPr>
+                <w:rFonts w:ascii="Calibri" w:hAnsi="Calibri"/>
+                <w:b w:val="0"/>
+                <w:color w:val="000000"/>
+                <w:sz w:val="18"/>
+              </w:rPr>
+              <w:t>Sandra Kopecky</w:t>
+            </w:r>
+          </w:p>
+        </w:tc>
+        <w:tc>
+          <w:tcPr>
+            <w:tcW w:type="dxa" w:w="6860"/>
+            <w:tcMar>
+              <w:top w:w="80" w:type="dxa"/>
+              <w:start w:w="120" w:type="dxa"/>
+              <w:bottom w:w="80" w:type="dxa"/>
+              <w:end w:w="120" w:type="dxa"/>
+            </w:tcMar>
+            <w:vAlign w:val="center"/>
+          </w:tcPr>
+          <w:p>
+            <w:pPr>
+              <w:keepLines/>
+              <w:spacing w:before="0" w:after="0" w:line="252" w:lineRule="auto"/>
+              <w:jc w:val="left"/>
+            </w:pPr>
+            <w:r/>
+            <w:r>
+              <w:rPr>
+                <w:rFonts w:ascii="Calibri" w:hAnsi="Calibri"/>
+                <w:b w:val="0"/>
+                <w:color w:val="000000"/>
+                <w:sz w:val="18"/>
+              </w:rPr>
+              <w:t>Data and database work, source review, and use of the approved dataset for analysis.</w:t>
+            </w:r>
+          </w:p>
+        </w:tc>
+      </w:tr>
+      <w:tr>
+        <w:trPr>
+          <w:cantSplit/>
+        </w:trPr>
+        <w:tc>
+          <w:tcPr>
+            <w:tcW w:type="dxa" w:w="2500"/>
+            <w:tcMar>
+              <w:top w:w="80" w:type="dxa"/>
+              <w:start w:w="120" w:type="dxa"/>
+              <w:bottom w:w="80" w:type="dxa"/>
+              <w:end w:w="120" w:type="dxa"/>
+            </w:tcMar>
+            <w:vAlign w:val="center"/>
+          </w:tcPr>
+          <w:p>
+            <w:pPr>
+              <w:keepLines/>
+              <w:spacing w:before="0" w:after="0" w:line="252" w:lineRule="auto"/>
+              <w:jc w:val="left"/>
+            </w:pPr>
+            <w:r/>
+            <w:r>
+              <w:rPr>
+                <w:rFonts w:ascii="Calibri" w:hAnsi="Calibri"/>
+                <w:b w:val="0"/>
+                <w:color w:val="000000"/>
+                <w:sz w:val="18"/>
+              </w:rPr>
+              <w:t>April Gillespie</w:t>
+            </w:r>
+          </w:p>
+        </w:tc>
+        <w:tc>
+          <w:tcPr>
+            <w:tcW w:type="dxa" w:w="6860"/>
+            <w:tcMar>
+              <w:top w:w="80" w:type="dxa"/>
+              <w:start w:w="120" w:type="dxa"/>
+              <w:bottom w:w="80" w:type="dxa"/>
+              <w:end w:w="120" w:type="dxa"/>
+            </w:tcMar>
+            <w:vAlign w:val="center"/>
+          </w:tcPr>
+          <w:p>
+            <w:pPr>
+              <w:keepLines/>
+              <w:spacing w:before="0" w:after="0" w:line="252" w:lineRule="auto"/>
+              <w:jc w:val="left"/>
+            </w:pPr>
+            <w:r/>
+            <w:r>
+              <w:rPr>
+                <w:rFonts w:ascii="Calibri" w:hAnsi="Calibri"/>
+                <w:b w:val="0"/>
+                <w:color w:val="000000"/>
+                <w:sz w:val="18"/>
+              </w:rPr>
+              <w:t>Repository management, analysis, technical implementation, documentation updates, and integration of validated team data.</w:t>
+            </w:r>
+          </w:p>
+        </w:tc>
+      </w:tr>
+      <w:tr>
+        <w:trPr>
+          <w:cantSplit/>
+        </w:trPr>
+        <w:tc>
+          <w:tcPr>
+            <w:tcW w:type="dxa" w:w="2500"/>
+            <w:tcMar>
+              <w:top w:w="80" w:type="dxa"/>
+              <w:start w:w="120" w:type="dxa"/>
+              <w:bottom w:w="80" w:type="dxa"/>
+              <w:end w:w="120" w:type="dxa"/>
+            </w:tcMar>
+            <w:vAlign w:val="center"/>
+          </w:tcPr>
+          <w:p>
+            <w:pPr>
+              <w:keepLines/>
+              <w:spacing w:before="0" w:after="0" w:line="252" w:lineRule="auto"/>
+              <w:jc w:val="left"/>
+            </w:pPr>
+            <w:r/>
+            <w:r>
+              <w:rPr>
+                <w:rFonts w:ascii="Calibri" w:hAnsi="Calibri"/>
+                <w:b w:val="0"/>
+                <w:color w:val="000000"/>
+                <w:sz w:val="18"/>
+              </w:rPr>
+              <w:t>Shared</w:t>
+            </w:r>
+          </w:p>
+        </w:tc>
+        <w:tc>
+          <w:tcPr>
+            <w:tcW w:type="dxa" w:w="6860"/>
+            <w:tcMar>
+              <w:top w:w="80" w:type="dxa"/>
+              <w:start w:w="120" w:type="dxa"/>
+              <w:bottom w:w="80" w:type="dxa"/>
+              <w:end w:w="120" w:type="dxa"/>
+            </w:tcMar>
+            <w:vAlign w:val="center"/>
+          </w:tcPr>
+          <w:p>
+            <w:pPr>
+              <w:keepLines/>
+              <w:spacing w:before="0" w:after="0" w:line="252" w:lineRule="auto"/>
+              <w:jc w:val="left"/>
+            </w:pPr>
+            <w:r/>
+            <w:r>
+              <w:rPr>
+                <w:rFonts w:ascii="Calibri" w:hAnsi="Calibri"/>
+                <w:b w:val="0"/>
+                <w:color w:val="000000"/>
+                <w:sz w:val="18"/>
+              </w:rPr>
+              <w:t>Review definitions and final numbers, record the presentation, and submit during the weekend ending September 13, 2026.</w:t>
             </w:r>
           </w:p>
         </w:tc>

</xml_diff>